<commit_message>
to advance in methodology
</commit_message>
<xml_diff>
--- a/CA1-ANDREA DIAZ MEDRANO - EXTRACT.docx
+++ b/CA1-ANDREA DIAZ MEDRANO - EXTRACT.docx
@@ -1394,13 +1394,7 @@
         <w:rPr>
           <w:rFonts w:ascii="Arial" w:hAnsi="Arial" w:cs="Arial"/>
         </w:rPr>
-        <w:t xml:space="preserve">using </w:t>
-      </w:r>
-      <w:r>
-        <w:rPr>
-          <w:rFonts w:ascii="Arial" w:hAnsi="Arial" w:cs="Arial"/>
-        </w:rPr>
-        <w:t>relevant historical corporate and tCO</w:t>
+        <w:t>using relevant historical corporate and tCO</w:t>
       </w:r>
       <w:r>
         <w:rPr>
@@ -1753,37 +1747,78 @@
         <w:jc w:val="both"/>
         <w:rPr>
           <w:rFonts w:ascii="Arial" w:hAnsi="Arial" w:cs="Arial"/>
-          <w:lang w:val="pt-BR"/>
-        </w:rPr>
-      </w:pPr>
-      <w:r>
-        <w:rPr>
-          <w:rFonts w:ascii="Arial" w:hAnsi="Arial" w:cs="Arial"/>
-          <w:lang w:val="pt-BR"/>
+        </w:rPr>
+      </w:pPr>
+      <w:r>
+        <w:rPr>
+          <w:rFonts w:ascii="Arial" w:hAnsi="Arial" w:cs="Arial"/>
         </w:rPr>
         <w:lastRenderedPageBreak/>
-        <w:t xml:space="preserve">En este primer acercamiento </w:t>
-      </w:r>
-      <w:r>
-        <w:rPr>
-          <w:rFonts w:ascii="Arial" w:hAnsi="Arial" w:cs="Arial"/>
-          <w:lang w:val="pt-BR"/>
-        </w:rPr>
-        <w:t>se plantea utilizar un metodo supervisado dabodo que nuestra informaciòn en su mayoria contendra etiquetas. Debido a que este es un problem en el que la informaciòn pincipal se encuentra en numeros se optara por un mo</w:t>
-      </w:r>
-      <w:r>
-        <w:rPr>
-          <w:rFonts w:ascii="Arial" w:hAnsi="Arial" w:cs="Arial"/>
-          <w:lang w:val="pt-BR"/>
-        </w:rPr>
-        <w:t>del</w:t>
-      </w:r>
-      <w:r>
-        <w:rPr>
-          <w:rFonts w:ascii="Arial" w:hAnsi="Arial" w:cs="Arial"/>
-          <w:lang w:val="pt-BR"/>
-        </w:rPr>
-        <w:t>o de regresion.</w:t>
+        <w:t>In this first approach, t</w:t>
+      </w:r>
+      <w:r>
+        <w:rPr>
+          <w:rFonts w:ascii="Arial" w:hAnsi="Arial" w:cs="Arial"/>
+        </w:rPr>
+        <w:t xml:space="preserve">he idea is to use a supervised learning method since the dataset will include known historical GHG emission values that can be used to train and evaluate the model. </w:t>
+      </w:r>
+    </w:p>
+    <w:p>
+      <w:pPr>
+        <w:pStyle w:val="NormalWeb"/>
+        <w:ind w:left="720"/>
+        <w:jc w:val="both"/>
+        <w:rPr>
+          <w:rFonts w:ascii="Arial" w:hAnsi="Arial" w:cs="Arial"/>
+        </w:rPr>
+      </w:pPr>
+      <w:r>
+        <w:rPr>
+          <w:rFonts w:ascii="Arial" w:hAnsi="Arial" w:cs="Arial"/>
+        </w:rPr>
+        <w:t>Since the goal is to estimate future values of Scope 1 and 2 expressed in tCO2e a regression model is proposed. L</w:t>
+      </w:r>
+      <w:r>
+        <w:rPr>
+          <w:rFonts w:ascii="Arial" w:hAnsi="Arial" w:cs="Arial"/>
+        </w:rPr>
+        <w:t xml:space="preserve">inear regression will be considered because of its usefulness in </w:t>
+      </w:r>
+      <w:r>
+        <w:rPr>
+          <w:rFonts w:ascii="Arial" w:hAnsi="Arial" w:cs="Arial"/>
+        </w:rPr>
+        <w:t>analysing</w:t>
+      </w:r>
+      <w:r>
+        <w:rPr>
+          <w:rFonts w:ascii="Arial" w:hAnsi="Arial" w:cs="Arial"/>
+        </w:rPr>
+        <w:t xml:space="preserve"> the relationship between the available corporate variables and emissions</w:t>
+      </w:r>
+      <w:r>
+        <w:rPr>
+          <w:rFonts w:ascii="Arial" w:hAnsi="Arial" w:cs="Arial"/>
+        </w:rPr>
+        <w:t xml:space="preserve"> additionally </w:t>
+      </w:r>
+      <w:r>
+        <w:rPr>
+          <w:rFonts w:ascii="Arial" w:hAnsi="Arial" w:cs="Arial"/>
+        </w:rPr>
+        <w:t xml:space="preserve">the review of the academic literature has made it possible to identify the use of regression techniques in prediction and emissions analysis studies, which provides a basis for considering this approach in the current project. </w:t>
+      </w:r>
+      <w:r>
+        <w:rPr>
+          <w:rFonts w:ascii="Arial" w:hAnsi="Arial" w:cs="Arial"/>
+        </w:rPr>
+        <w:t>However, t</w:t>
+      </w:r>
+      <w:r>
+        <w:rPr>
+          <w:rFonts w:ascii="Arial" w:hAnsi="Arial" w:cs="Arial"/>
+        </w:rPr>
+        <w:t>he final choice of model will depend on the quantity, quality, and temporal structure of the collected data.</w:t>
       </w:r>
     </w:p>
     <w:p>
@@ -1843,21 +1878,7 @@
           <w:rFonts w:ascii="Arial" w:hAnsi="Arial" w:cs="Arial"/>
           <w:lang w:val="pt-BR"/>
         </w:rPr>
-        <w:t xml:space="preserve">Para fines de este proyecto usaremos </w:t>
-      </w:r>
-      <w:r>
-        <w:rPr>
-          <w:rFonts w:ascii="Arial" w:hAnsi="Arial" w:cs="Arial"/>
-          <w:lang w:val="pt-BR"/>
-        </w:rPr>
-        <w:t>the mean squared error (MSE) and R-squared (R²)</w:t>
-      </w:r>
-      <w:r>
-        <w:rPr>
-          <w:rFonts w:ascii="Arial" w:hAnsi="Arial" w:cs="Arial"/>
-          <w:lang w:val="pt-BR"/>
-        </w:rPr>
-        <w:t xml:space="preserve"> dado a que </w:t>
+        <w:t xml:space="preserve">Para fines de este proyecto usaremos the mean squared error (MSE) and R-squared (R²) dado a que </w:t>
       </w:r>
       <w:r>
         <w:rPr>
@@ -2193,6 +2214,7 @@
           <w:bCs/>
           <w:color w:val="auto"/>
         </w:rPr>
+        <w:lastRenderedPageBreak/>
         <w:t>X</w:t>
       </w:r>
       <w:r>
@@ -2239,7 +2261,6 @@
         <w:rPr>
           <w:lang w:val="en-GB"/>
         </w:rPr>
-        <w:lastRenderedPageBreak/>
         <w:t>Glosario</w:t>
       </w:r>
       <w:commentRangeEnd w:id="10"/>
@@ -3495,6 +3516,7 @@
   <w:style w:type="character" w:default="1" w:styleId="DefaultParagraphFont">
     <w:name w:val="Default Paragraph Font"/>
     <w:uiPriority w:val="1"/>
+    <w:semiHidden/>
     <w:unhideWhenUsed/>
   </w:style>
   <w:style w:type="table" w:default="1" w:styleId="TableNormal">

</xml_diff>